<commit_message>
Add KeyVend project, update Loop screenshots/status
</commit_message>
<xml_diff>
--- a/Adeyemi_Misturah_Resume.docx
+++ b/Adeyemi_Misturah_Resume.docx
@@ -39,7 +39,7 @@
         <w:spacing w:after="100"/>
         <w:jc w:val="center"/>
       </w:pPr>
-      <w:hyperlink w:history="1" r:id="rIdwff_h5kaz9uuujvhuynbw">
+      <w:hyperlink w:history="1" r:id="rIdgjlak18ktsc0bsji3-9-v">
         <w:r>
           <w:rPr>
             <w:rFonts w:ascii="Calibri" w:cs="Calibri" w:eastAsia="Calibri" w:hAnsi="Calibri"/>
@@ -60,7 +60,7 @@
         </w:rPr>
         <w:t xml:space="preserve">  •  </w:t>
       </w:r>
-      <w:hyperlink w:history="1" r:id="rIdy7h8mbmoupgpjggtsfyxg">
+      <w:hyperlink w:history="1" r:id="rIdgkstfayo5z7flamvr2ohd">
         <w:r>
           <w:rPr>
             <w:rFonts w:ascii="Calibri" w:cs="Calibri" w:eastAsia="Calibri" w:hAnsi="Calibri"/>
@@ -81,7 +81,7 @@
         </w:rPr>
         <w:t xml:space="preserve">  •  </w:t>
       </w:r>
-      <w:hyperlink w:history="1" r:id="rIdctrlbeljr0vprrx4rylos">
+      <w:hyperlink w:history="1" r:id="rIda6oyalpcabrkt2o-7qh3w">
         <w:r>
           <w:rPr>
             <w:rFonts w:ascii="Calibri" w:cs="Calibri" w:eastAsia="Calibri" w:hAnsi="Calibri"/>
@@ -193,7 +193,7 @@
           <w:sz w:val="20"/>
           <w:szCs w:val="20"/>
         </w:rPr>
-        <w:t xml:space="preserve">Multi-OEM Terminal SDKs (HorizonPay, Topwise, Dspread, Morefun), EMV &amp; Contactless Card Processing, PIN Pad Key Injection (TMK/TPK/TSK), Mifare/NFC/CPU Card Reading, Bluetooth &amp; Serial Device Integration, Receipt Printing, TLV Parsing</w:t>
+        <w:t xml:space="preserve">Multi-OEM Terminal SDKs (HorizonPay, Topwise, Dspread, Morefun), EMV &amp; Contactless Card Processing, Secure PIN Pad Key Injection &amp; Encryption Key Management, Mifare/NFC/CPU Card Reading, Bluetooth &amp; Serial Device Integration, Receipt Printing, TLV Parsing</w:t>
       </w:r>
     </w:p>
     <w:p>
@@ -218,7 +218,7 @@
           <w:sz w:val="20"/>
           <w:szCs w:val="20"/>
         </w:rPr>
-        <w:t xml:space="preserve">Node.js, NestJS, Express.js, Prisma, REST APIs, JWT, OAuth2, Role-Based Access Control</w:t>
+        <w:t xml:space="preserve">Node.js, NestJS, Express.js, Prisma, RESTful API Design, Database Modeling, Authentication &amp; Authorization (JWT, OAuth2), Role-Based Access Control, Third-Party &amp; Webhook Integrations</w:t>
       </w:r>
     </w:p>
     <w:p>
@@ -402,26 +402,7 @@
           <w:sz w:val="19"/>
           <w:szCs w:val="19"/>
         </w:rPr>
-        <w:t xml:space="preserve">Architected OctopusTMS, a unified native Android SDK abstracting three POS terminal OEMs — HorizonPay, Topwise, and Dspread — behind a single API, with runtime device auto-detection, EMV/contactless transaction processing, online/offline PIN entry, TMK/TPK/TSK key injection, and receipt printing.</w:t>
-      </w:r>
-    </w:p>
-    <w:p>
-      <w:pPr>
-        <w:pStyle w:val="ListParagraph"/>
-        <w:numPr>
-          <w:ilvl w:val="0"/>
-          <w:numId w:val="2"/>
-        </w:numPr>
-        <w:spacing w:after="30" w:line="260"/>
-      </w:pPr>
-      <w:r>
-        <w:rPr>
-          <w:rFonts w:ascii="Calibri" w:cs="Calibri" w:eastAsia="Calibri" w:hAnsi="Calibri"/>
-          <w:color w:val="1A1A1A"/>
-          <w:sz w:val="19"/>
-          <w:szCs w:val="19"/>
-        </w:rPr>
-        <w:t xml:space="preserve">Built MacrotechMFYSDK, a native Android SDK for Morefun POS terminals covering EMV and RuPay card processing, Mifare/NFC/CPU card reading, QR code payments, Bluetooth and multi-printer support, and terminal management system (TMS) key provisioning.</w:t>
+        <w:t xml:space="preserve">Architected OctopusTMS, a unified native Android SDK abstracting four POS terminal OEMs — HorizonPay, Topwise, Dspread (terminal &amp; card reader), and Morefun — behind a single API, with runtime device auto-detection, EMV/contactless transaction processing, Mifare/NFC/CPU card reading, QR code payments, PIN pad key injection &amp; encryption key management, and Bluetooth/multi-printer support.</w:t>
       </w:r>
     </w:p>
     <w:p>
@@ -459,64 +440,83 @@
           <w:sz w:val="19"/>
           <w:szCs w:val="19"/>
         </w:rPr>
-        <w:t xml:space="preserve">Led full-stack development for an e-commerce food delivery platform (Flutter frontend + NestJS backend) with FCM push notifications for order updates.</w:t>
-      </w:r>
-    </w:p>
-    <w:p>
-      <w:pPr>
-        <w:pStyle w:val="ListParagraph"/>
-        <w:numPr>
-          <w:ilvl w:val="0"/>
-          <w:numId w:val="2"/>
-        </w:numPr>
-        <w:spacing w:after="30" w:line="260"/>
-      </w:pPr>
-      <w:r>
-        <w:rPr>
-          <w:rFonts w:ascii="Calibri" w:cs="Calibri" w:eastAsia="Calibri" w:hAnsi="Calibri"/>
-          <w:color w:val="1A1A1A"/>
-          <w:sz w:val="19"/>
-          <w:szCs w:val="19"/>
-        </w:rPr>
-        <w:t xml:space="preserve">Built the mobile app for Loop, a multitenancy cooperative/microfinance platform (Flutter, Riverpod) — capital, savings, loan and transaction accounts, loan requests with eligibility checks, guarantor requests, and interbank transfers.</w:t>
-      </w:r>
-    </w:p>
-    <w:p>
-      <w:pPr>
-        <w:pStyle w:val="ListParagraph"/>
-        <w:numPr>
-          <w:ilvl w:val="0"/>
-          <w:numId w:val="2"/>
-        </w:numPr>
-        <w:spacing w:after="30" w:line="260"/>
-      </w:pPr>
-      <w:r>
-        <w:rPr>
-          <w:rFonts w:ascii="Calibri" w:cs="Calibri" w:eastAsia="Calibri" w:hAnsi="Calibri"/>
-          <w:color w:val="1A1A1A"/>
-          <w:sz w:val="19"/>
-          <w:szCs w:val="19"/>
-        </w:rPr>
-        <w:t xml:space="preserve">Led end-to-end development of the LUTH Patient App for Lagos University Teaching Hospital — Flutter (Riverpod) frontend and NestJS backend — covering UHID-based patient authentication, RRR invoice lookup, hospital bill payments via bank transfer and QR/card, and telemedicine access. Currently in store testing.</w:t>
-      </w:r>
-    </w:p>
-    <w:p>
-      <w:pPr>
-        <w:pStyle w:val="ListParagraph"/>
-        <w:numPr>
-          <w:ilvl w:val="0"/>
-          <w:numId w:val="2"/>
-        </w:numPr>
-        <w:spacing w:after="30" w:line="260"/>
-      </w:pPr>
-      <w:r>
-        <w:rPr>
-          <w:rFonts w:ascii="Calibri" w:cs="Calibri" w:eastAsia="Calibri" w:hAnsi="Calibri"/>
-          <w:color w:val="1A1A1A"/>
-          <w:sz w:val="19"/>
-          <w:szCs w:val="19"/>
-        </w:rPr>
-        <w:t xml:space="preserve">Led end-to-end development of the MRA SWzone Estate App (Magodo Residents Association) — Flutter (Riverpod) frontend and NestJS backend — featuring visitor QR tokens, emergency security and ambulance alerts, incident reporting with photo attachments, artisan and property directories, and airtime/data VTU integration. Currently in store testing.</w:t>
+        <w:t xml:space="preserve">Led full-stack development for an e-commerce food delivery platform — Flutter frontend + NestJS/Prisma backend (RESTful APIs, order &amp; payment data modeling) — with FCM push notifications for order updates.</w:t>
+      </w:r>
+    </w:p>
+    <w:p>
+      <w:pPr>
+        <w:pStyle w:val="ListParagraph"/>
+        <w:numPr>
+          <w:ilvl w:val="0"/>
+          <w:numId w:val="2"/>
+        </w:numPr>
+        <w:spacing w:after="30" w:line="260"/>
+      </w:pPr>
+      <w:r>
+        <w:rPr>
+          <w:rFonts w:ascii="Calibri" w:cs="Calibri" w:eastAsia="Calibri" w:hAnsi="Calibri"/>
+          <w:color w:val="1A1A1A"/>
+          <w:sz w:val="19"/>
+          <w:szCs w:val="19"/>
+        </w:rPr>
+        <w:t xml:space="preserve">Built the mobile app for Loop, a multitenancy cooperative/microfinance platform (Flutter, Riverpod) — capital, savings, loan and transaction accounts, loan requests with eligibility checks, guarantor requests, and bill payments. Live on Google Play, in review on Apple App Store.</w:t>
+      </w:r>
+    </w:p>
+    <w:p>
+      <w:pPr>
+        <w:pStyle w:val="ListParagraph"/>
+        <w:numPr>
+          <w:ilvl w:val="0"/>
+          <w:numId w:val="2"/>
+        </w:numPr>
+        <w:spacing w:after="30" w:line="260"/>
+      </w:pPr>
+      <w:r>
+        <w:rPr>
+          <w:rFonts w:ascii="Calibri" w:cs="Calibri" w:eastAsia="Calibri" w:hAnsi="Calibri"/>
+          <w:color w:val="1A1A1A"/>
+          <w:sz w:val="19"/>
+          <w:szCs w:val="19"/>
+        </w:rPr>
+        <w:t xml:space="preserve">Led end-to-end development of the LUTH Patient App for Lagos University Teaching Hospital — Flutter (Riverpod) frontend and NestJS backend with RESTful APIs, UHID-based JWT authentication, and RRR invoice/billing logic — covering hospital bill payments via bank transfer and QR/card, and telemedicine access. Currently in store testing.</w:t>
+      </w:r>
+    </w:p>
+    <w:p>
+      <w:pPr>
+        <w:pStyle w:val="ListParagraph"/>
+        <w:numPr>
+          <w:ilvl w:val="0"/>
+          <w:numId w:val="2"/>
+        </w:numPr>
+        <w:spacing w:after="30" w:line="260"/>
+      </w:pPr>
+      <w:r>
+        <w:rPr>
+          <w:rFonts w:ascii="Calibri" w:cs="Calibri" w:eastAsia="Calibri" w:hAnsi="Calibri"/>
+          <w:color w:val="1A1A1A"/>
+          <w:sz w:val="19"/>
+          <w:szCs w:val="19"/>
+        </w:rPr>
+        <w:t xml:space="preserve">Led end-to-end development of the MRA SWzone Estate App (Magodo Residents Association) — Flutter (Riverpod) frontend and NestJS backend with RESTful APIs and role-based access across resident, security, and admin roles — featuring visitor QR tokens, emergency security and ambulance alerts, incident reporting with photo attachments, artisan and property directories, and airtime/data VTU integration. Live on Google Play and Apple App Store.</w:t>
+      </w:r>
+    </w:p>
+    <w:p>
+      <w:pPr>
+        <w:pStyle w:val="ListParagraph"/>
+        <w:numPr>
+          <w:ilvl w:val="0"/>
+          <w:numId w:val="2"/>
+        </w:numPr>
+        <w:spacing w:after="30" w:line="260"/>
+      </w:pPr>
+      <w:r>
+        <w:rPr>
+          <w:rFonts w:ascii="Calibri" w:cs="Calibri" w:eastAsia="Calibri" w:hAnsi="Calibri"/>
+          <w:color w:val="1A1A1A"/>
+          <w:sz w:val="19"/>
+          <w:szCs w:val="19"/>
+        </w:rPr>
+        <w:t xml:space="preserve">Building KeyVend, an estate resident app (Flutter) for Lekki Gardens Phase 2 — in-app wallet with funding/payments, visitor PIN generation and access management, service-charge and levy payments, and smart water-meter token purchases.</w:t>
       </w:r>
     </w:p>
     <w:p>
@@ -819,45 +819,45 @@
           <w:sz w:val="21"/>
           <w:szCs w:val="21"/>
         </w:rPr>
-        <w:t xml:space="preserve">OctopusTMS — Multi-OEM POS Terminal SDK</w:t>
-      </w:r>
-    </w:p>
-    <w:p>
-      <w:pPr>
-        <w:pStyle w:val="ListParagraph"/>
-        <w:numPr>
-          <w:ilvl w:val="0"/>
-          <w:numId w:val="2"/>
-        </w:numPr>
-        <w:spacing w:after="30" w:line="260"/>
-      </w:pPr>
-      <w:r>
-        <w:rPr>
-          <w:rFonts w:ascii="Calibri" w:cs="Calibri" w:eastAsia="Calibri" w:hAnsi="Calibri"/>
-          <w:color w:val="1A1A1A"/>
-          <w:sz w:val="19"/>
-          <w:szCs w:val="19"/>
-        </w:rPr>
-        <w:t xml:space="preserve">Unified native Android/Kotlin SDK abstracting HorizonPay, Topwise, and Dspread POS terminals behind a single API, with automatic OEM detection at runtime.</w:t>
-      </w:r>
-    </w:p>
-    <w:p>
-      <w:pPr>
-        <w:pStyle w:val="ListParagraph"/>
-        <w:numPr>
-          <w:ilvl w:val="0"/>
-          <w:numId w:val="2"/>
-        </w:numPr>
-        <w:spacing w:after="30" w:line="260"/>
-      </w:pPr>
-      <w:r>
-        <w:rPr>
-          <w:rFonts w:ascii="Calibri" w:cs="Calibri" w:eastAsia="Calibri" w:hAnsi="Calibri"/>
-          <w:color w:val="1A1A1A"/>
-          <w:sz w:val="19"/>
-          <w:szCs w:val="19"/>
-        </w:rPr>
-        <w:t xml:space="preserve">Handles EMV/contactless transactions, magstripe/chip/tap card reading, PIN pad online and offline PIN entry, TMK/TPK/TSK key injection, and receipt printing/rendering.</w:t>
+        <w:t xml:space="preserve">OctopusTMS — Unified Multi-OEM POS Terminal SDK</w:t>
+      </w:r>
+    </w:p>
+    <w:p>
+      <w:pPr>
+        <w:pStyle w:val="ListParagraph"/>
+        <w:numPr>
+          <w:ilvl w:val="0"/>
+          <w:numId w:val="2"/>
+        </w:numPr>
+        <w:spacing w:after="30" w:line="260"/>
+      </w:pPr>
+      <w:r>
+        <w:rPr>
+          <w:rFonts w:ascii="Calibri" w:cs="Calibri" w:eastAsia="Calibri" w:hAnsi="Calibri"/>
+          <w:color w:val="1A1A1A"/>
+          <w:sz w:val="19"/>
+          <w:szCs w:val="19"/>
+        </w:rPr>
+        <w:t xml:space="preserve">Native Android/Kotlin SDK abstracting four payment-terminal OEMs — HorizonPay, Topwise, Dspread (POS terminal &amp; card reader), and Morefun — behind a single API, with automatic device detection at runtime.</w:t>
+      </w:r>
+    </w:p>
+    <w:p>
+      <w:pPr>
+        <w:pStyle w:val="ListParagraph"/>
+        <w:numPr>
+          <w:ilvl w:val="0"/>
+          <w:numId w:val="2"/>
+        </w:numPr>
+        <w:spacing w:after="30" w:line="260"/>
+      </w:pPr>
+      <w:r>
+        <w:rPr>
+          <w:rFonts w:ascii="Calibri" w:cs="Calibri" w:eastAsia="Calibri" w:hAnsi="Calibri"/>
+          <w:color w:val="1A1A1A"/>
+          <w:sz w:val="19"/>
+          <w:szCs w:val="19"/>
+        </w:rPr>
+        <w:t xml:space="preserve">Handles EMV/contactless transactions, magstripe/chip/tap and Mifare/NFC/CPU card reading, QR code payments, PIN pad key injection &amp; encryption key management, barcode scanning, and Bluetooth/multi-printer support.</w:t>
       </w:r>
     </w:p>
     <w:p>
@@ -892,45 +892,45 @@
           <w:sz w:val="21"/>
           <w:szCs w:val="21"/>
         </w:rPr>
-        <w:t xml:space="preserve">MacrotechMFYSDK — Morefun POS Terminal SDK</w:t>
-      </w:r>
-    </w:p>
-    <w:p>
-      <w:pPr>
-        <w:pStyle w:val="ListParagraph"/>
-        <w:numPr>
-          <w:ilvl w:val="0"/>
-          <w:numId w:val="2"/>
-        </w:numPr>
-        <w:spacing w:after="30" w:line="260"/>
-      </w:pPr>
-      <w:r>
-        <w:rPr>
-          <w:rFonts w:ascii="Calibri" w:cs="Calibri" w:eastAsia="Calibri" w:hAnsi="Calibri"/>
-          <w:color w:val="1A1A1A"/>
-          <w:sz w:val="19"/>
-          <w:szCs w:val="19"/>
-        </w:rPr>
-        <w:t xml:space="preserve">Native Android SDK integrating the Morefun YSDK for EMV, RuPay, and Mifare/NFC/CPU card transactions.</w:t>
-      </w:r>
-    </w:p>
-    <w:p>
-      <w:pPr>
-        <w:pStyle w:val="ListParagraph"/>
-        <w:numPr>
-          <w:ilvl w:val="0"/>
-          <w:numId w:val="2"/>
-        </w:numPr>
-        <w:spacing w:after="30" w:line="260"/>
-      </w:pPr>
-      <w:r>
-        <w:rPr>
-          <w:rFonts w:ascii="Calibri" w:cs="Calibri" w:eastAsia="Calibri" w:hAnsi="Calibri"/>
-          <w:color w:val="1A1A1A"/>
-          <w:sz w:val="19"/>
-          <w:szCs w:val="19"/>
-        </w:rPr>
-        <w:t xml:space="preserve">Supports QR code payments, Bluetooth and built-in receipt printing, barcode scanning, LED/beeper feedback, and TMS-based key download and injection.</w:t>
+        <w:t xml:space="preserve">Macropay Mobile App</w:t>
+      </w:r>
+    </w:p>
+    <w:p>
+      <w:pPr>
+        <w:pStyle w:val="ListParagraph"/>
+        <w:numPr>
+          <w:ilvl w:val="0"/>
+          <w:numId w:val="2"/>
+        </w:numPr>
+        <w:spacing w:after="30" w:line="260"/>
+      </w:pPr>
+      <w:r>
+        <w:rPr>
+          <w:rFonts w:ascii="Calibri" w:cs="Calibri" w:eastAsia="Calibri" w:hAnsi="Calibri"/>
+          <w:color w:val="1A1A1A"/>
+          <w:sz w:val="19"/>
+          <w:szCs w:val="19"/>
+        </w:rPr>
+        <w:t xml:space="preserve">Cross-platform fintech app built with Flutter, Cubit state management, and Firebase Cloud Messaging (FCM) for push notifications.</w:t>
+      </w:r>
+    </w:p>
+    <w:p>
+      <w:pPr>
+        <w:pStyle w:val="ListParagraph"/>
+        <w:numPr>
+          <w:ilvl w:val="0"/>
+          <w:numId w:val="2"/>
+        </w:numPr>
+        <w:spacing w:after="30" w:line="260"/>
+      </w:pPr>
+      <w:r>
+        <w:rPr>
+          <w:rFonts w:ascii="Calibri" w:cs="Calibri" w:eastAsia="Calibri" w:hAnsi="Calibri"/>
+          <w:color w:val="1A1A1A"/>
+          <w:sz w:val="19"/>
+          <w:szCs w:val="19"/>
+        </w:rPr>
+        <w:t xml:space="preserve">Integrated virtual accounts, payment processing, and user verification APIs. Published to Google Play Store and Apple App Store.</w:t>
       </w:r>
     </w:p>
     <w:p>
@@ -946,45 +946,45 @@
           <w:sz w:val="21"/>
           <w:szCs w:val="21"/>
         </w:rPr>
-        <w:t xml:space="preserve">Macropay Mobile App</w:t>
-      </w:r>
-    </w:p>
-    <w:p>
-      <w:pPr>
-        <w:pStyle w:val="ListParagraph"/>
-        <w:numPr>
-          <w:ilvl w:val="0"/>
-          <w:numId w:val="2"/>
-        </w:numPr>
-        <w:spacing w:after="30" w:line="260"/>
-      </w:pPr>
-      <w:r>
-        <w:rPr>
-          <w:rFonts w:ascii="Calibri" w:cs="Calibri" w:eastAsia="Calibri" w:hAnsi="Calibri"/>
-          <w:color w:val="1A1A1A"/>
-          <w:sz w:val="19"/>
-          <w:szCs w:val="19"/>
-        </w:rPr>
-        <w:t xml:space="preserve">Cross-platform fintech app built with Flutter, Cubit state management, and Firebase Cloud Messaging (FCM) for push notifications.</w:t>
-      </w:r>
-    </w:p>
-    <w:p>
-      <w:pPr>
-        <w:pStyle w:val="ListParagraph"/>
-        <w:numPr>
-          <w:ilvl w:val="0"/>
-          <w:numId w:val="2"/>
-        </w:numPr>
-        <w:spacing w:after="30" w:line="260"/>
-      </w:pPr>
-      <w:r>
-        <w:rPr>
-          <w:rFonts w:ascii="Calibri" w:cs="Calibri" w:eastAsia="Calibri" w:hAnsi="Calibri"/>
-          <w:color w:val="1A1A1A"/>
-          <w:sz w:val="19"/>
-          <w:szCs w:val="19"/>
-        </w:rPr>
-        <w:t xml:space="preserve">Integrated virtual accounts, payment processing, and user verification APIs. Published to Google Play Store and Apple App Store.</w:t>
+        <w:t xml:space="preserve">Nourish Food E-Commerce Platform (Nourished Choice)</w:t>
+      </w:r>
+    </w:p>
+    <w:p>
+      <w:pPr>
+        <w:pStyle w:val="ListParagraph"/>
+        <w:numPr>
+          <w:ilvl w:val="0"/>
+          <w:numId w:val="2"/>
+        </w:numPr>
+        <w:spacing w:after="30" w:line="260"/>
+      </w:pPr>
+      <w:r>
+        <w:rPr>
+          <w:rFonts w:ascii="Calibri" w:cs="Calibri" w:eastAsia="Calibri" w:hAnsi="Calibri"/>
+          <w:color w:val="1A1A1A"/>
+          <w:sz w:val="19"/>
+          <w:szCs w:val="19"/>
+        </w:rPr>
+        <w:t xml:space="preserve">End-to-end development: Flutter frontend + NestJS/Prisma backend — RESTful APIs, relational data modeling for orders/menus/payments, and authentication — with FCM real-time order status notifications.</w:t>
+      </w:r>
+    </w:p>
+    <w:p>
+      <w:pPr>
+        <w:pStyle w:val="ListParagraph"/>
+        <w:numPr>
+          <w:ilvl w:val="0"/>
+          <w:numId w:val="2"/>
+        </w:numPr>
+        <w:spacing w:after="30" w:line="260"/>
+      </w:pPr>
+      <w:r>
+        <w:rPr>
+          <w:rFonts w:ascii="Calibri" w:cs="Calibri" w:eastAsia="Calibri" w:hAnsi="Calibri"/>
+          <w:color w:val="1A1A1A"/>
+          <w:sz w:val="19"/>
+          <w:szCs w:val="19"/>
+        </w:rPr>
+        <w:t xml:space="preserve">Features include user authentication, ordering, and payment processing. Published to Google Play Store and Apple App Store.</w:t>
       </w:r>
     </w:p>
     <w:p>
@@ -1000,45 +1000,45 @@
           <w:sz w:val="21"/>
           <w:szCs w:val="21"/>
         </w:rPr>
-        <w:t xml:space="preserve">Nourish Food E-Commerce Platform (Nourished Choice)</w:t>
-      </w:r>
-    </w:p>
-    <w:p>
-      <w:pPr>
-        <w:pStyle w:val="ListParagraph"/>
-        <w:numPr>
-          <w:ilvl w:val="0"/>
-          <w:numId w:val="2"/>
-        </w:numPr>
-        <w:spacing w:after="30" w:line="260"/>
-      </w:pPr>
-      <w:r>
-        <w:rPr>
-          <w:rFonts w:ascii="Calibri" w:cs="Calibri" w:eastAsia="Calibri" w:hAnsi="Calibri"/>
-          <w:color w:val="1A1A1A"/>
-          <w:sz w:val="19"/>
-          <w:szCs w:val="19"/>
-        </w:rPr>
-        <w:t xml:space="preserve">End-to-end development: Flutter frontend + NestJS backend, with FCM real-time order status notifications.</w:t>
-      </w:r>
-    </w:p>
-    <w:p>
-      <w:pPr>
-        <w:pStyle w:val="ListParagraph"/>
-        <w:numPr>
-          <w:ilvl w:val="0"/>
-          <w:numId w:val="2"/>
-        </w:numPr>
-        <w:spacing w:after="30" w:line="260"/>
-      </w:pPr>
-      <w:r>
-        <w:rPr>
-          <w:rFonts w:ascii="Calibri" w:cs="Calibri" w:eastAsia="Calibri" w:hAnsi="Calibri"/>
-          <w:color w:val="1A1A1A"/>
-          <w:sz w:val="19"/>
-          <w:szCs w:val="19"/>
-        </w:rPr>
-        <w:t xml:space="preserve">Features include user authentication, ordering, and payment processing. Published to Google Play Store and Apple App Store.</w:t>
+        <w:t xml:space="preserve">Loop — Cooperative &amp; Microfinance App</w:t>
+      </w:r>
+    </w:p>
+    <w:p>
+      <w:pPr>
+        <w:pStyle w:val="ListParagraph"/>
+        <w:numPr>
+          <w:ilvl w:val="0"/>
+          <w:numId w:val="2"/>
+        </w:numPr>
+        <w:spacing w:after="30" w:line="260"/>
+      </w:pPr>
+      <w:r>
+        <w:rPr>
+          <w:rFonts w:ascii="Calibri" w:cs="Calibri" w:eastAsia="Calibri" w:hAnsi="Calibri"/>
+          <w:color w:val="1A1A1A"/>
+          <w:sz w:val="19"/>
+          <w:szCs w:val="19"/>
+        </w:rPr>
+        <w:t xml:space="preserve">Cross-platform Flutter application (Riverpod) supporting multitenancy architecture with isolated tenant data and shared infrastructure.</w:t>
+      </w:r>
+    </w:p>
+    <w:p>
+      <w:pPr>
+        <w:pStyle w:val="ListParagraph"/>
+        <w:numPr>
+          <w:ilvl w:val="0"/>
+          <w:numId w:val="2"/>
+        </w:numPr>
+        <w:spacing w:after="30" w:line="260"/>
+      </w:pPr>
+      <w:r>
+        <w:rPr>
+          <w:rFonts w:ascii="Calibri" w:cs="Calibri" w:eastAsia="Calibri" w:hAnsi="Calibri"/>
+          <w:color w:val="1A1A1A"/>
+          <w:sz w:val="19"/>
+          <w:szCs w:val="19"/>
+        </w:rPr>
+        <w:t xml:space="preserve">Member capital, savings, loan and transaction accounts; loan request flow with eligibility checks; guarantor requests; and bill payments (airtime, data, electricity). Live on Google Play, in review on Apple App Store.</w:t>
       </w:r>
     </w:p>
     <w:p>
@@ -1054,45 +1054,45 @@
           <w:sz w:val="21"/>
           <w:szCs w:val="21"/>
         </w:rPr>
-        <w:t xml:space="preserve">Loop — Cooperative &amp; Microfinance App</w:t>
-      </w:r>
-    </w:p>
-    <w:p>
-      <w:pPr>
-        <w:pStyle w:val="ListParagraph"/>
-        <w:numPr>
-          <w:ilvl w:val="0"/>
-          <w:numId w:val="2"/>
-        </w:numPr>
-        <w:spacing w:after="30" w:line="260"/>
-      </w:pPr>
-      <w:r>
-        <w:rPr>
-          <w:rFonts w:ascii="Calibri" w:cs="Calibri" w:eastAsia="Calibri" w:hAnsi="Calibri"/>
-          <w:color w:val="1A1A1A"/>
-          <w:sz w:val="19"/>
-          <w:szCs w:val="19"/>
-        </w:rPr>
-        <w:t xml:space="preserve">Cross-platform Flutter application (Riverpod) supporting multitenancy architecture with isolated tenant data and shared infrastructure.</w:t>
-      </w:r>
-    </w:p>
-    <w:p>
-      <w:pPr>
-        <w:pStyle w:val="ListParagraph"/>
-        <w:numPr>
-          <w:ilvl w:val="0"/>
-          <w:numId w:val="2"/>
-        </w:numPr>
-        <w:spacing w:after="30" w:line="260"/>
-      </w:pPr>
-      <w:r>
-        <w:rPr>
-          <w:rFonts w:ascii="Calibri" w:cs="Calibri" w:eastAsia="Calibri" w:hAnsi="Calibri"/>
-          <w:color w:val="1A1A1A"/>
-          <w:sz w:val="19"/>
-          <w:szCs w:val="19"/>
-        </w:rPr>
-        <w:t xml:space="preserve">Member capital, savings, loan and transaction accounts; loan request flow with eligibility checks; guarantor requests; and interbank transfers.</w:t>
+        <w:t xml:space="preserve">LUTH Patient App</w:t>
+      </w:r>
+    </w:p>
+    <w:p>
+      <w:pPr>
+        <w:pStyle w:val="ListParagraph"/>
+        <w:numPr>
+          <w:ilvl w:val="0"/>
+          <w:numId w:val="2"/>
+        </w:numPr>
+        <w:spacing w:after="30" w:line="260"/>
+      </w:pPr>
+      <w:r>
+        <w:rPr>
+          <w:rFonts w:ascii="Calibri" w:cs="Calibri" w:eastAsia="Calibri" w:hAnsi="Calibri"/>
+          <w:color w:val="1A1A1A"/>
+          <w:sz w:val="19"/>
+          <w:szCs w:val="19"/>
+        </w:rPr>
+        <w:t xml:space="preserve">Led end-to-end development for Lagos University Teaching Hospital: Flutter/Riverpod frontend and a NestJS backend exposing RESTful APIs for UHID-based authentication, RRR invoice generation/lookup, and billing.</w:t>
+      </w:r>
+    </w:p>
+    <w:p>
+      <w:pPr>
+        <w:pStyle w:val="ListParagraph"/>
+        <w:numPr>
+          <w:ilvl w:val="0"/>
+          <w:numId w:val="2"/>
+        </w:numPr>
+        <w:spacing w:after="30" w:line="260"/>
+      </w:pPr>
+      <w:r>
+        <w:rPr>
+          <w:rFonts w:ascii="Calibri" w:cs="Calibri" w:eastAsia="Calibri" w:hAnsi="Calibri"/>
+          <w:color w:val="1A1A1A"/>
+          <w:sz w:val="19"/>
+          <w:szCs w:val="19"/>
+        </w:rPr>
+        <w:t xml:space="preserve">Hospital bill payments via bank transfer and QR/card payment, telemedicine access, and SERVICOM patient support. In store testing.</w:t>
       </w:r>
     </w:p>
     <w:p>
@@ -1108,26 +1108,45 @@
           <w:sz w:val="21"/>
           <w:szCs w:val="21"/>
         </w:rPr>
-        <w:t xml:space="preserve">LUTH Patient App</w:t>
-      </w:r>
-    </w:p>
-    <w:p>
-      <w:pPr>
-        <w:pStyle w:val="ListParagraph"/>
-        <w:numPr>
-          <w:ilvl w:val="0"/>
-          <w:numId w:val="2"/>
-        </w:numPr>
-        <w:spacing w:after="30" w:line="260"/>
-      </w:pPr>
-      <w:r>
-        <w:rPr>
-          <w:rFonts w:ascii="Calibri" w:cs="Calibri" w:eastAsia="Calibri" w:hAnsi="Calibri"/>
-          <w:color w:val="1A1A1A"/>
-          <w:sz w:val="19"/>
-          <w:szCs w:val="19"/>
-        </w:rPr>
-        <w:t xml:space="preserve">Led end-to-end development (Flutter/Riverpod frontend + NestJS backend) for Lagos University Teaching Hospital — UHID-based sign-up/login, hospital bill payments via RRR invoice lookup, bank transfer and QR/card payment, telemedicine access, and SERVICOM patient support. In store testing.</w:t>
+        <w:t xml:space="preserve">MRA SWzone Estate App (Magodo Residents Association)</w:t>
+      </w:r>
+    </w:p>
+    <w:p>
+      <w:pPr>
+        <w:pStyle w:val="ListParagraph"/>
+        <w:numPr>
+          <w:ilvl w:val="0"/>
+          <w:numId w:val="2"/>
+        </w:numPr>
+        <w:spacing w:after="30" w:line="260"/>
+      </w:pPr>
+      <w:r>
+        <w:rPr>
+          <w:rFonts w:ascii="Calibri" w:cs="Calibri" w:eastAsia="Calibri" w:hAnsi="Calibri"/>
+          <w:color w:val="1A1A1A"/>
+          <w:sz w:val="19"/>
+          <w:szCs w:val="19"/>
+        </w:rPr>
+        <w:t xml:space="preserve">Led end-to-end development for a residential estate: Flutter/Riverpod frontend and a NestJS backend with role-based APIs across resident, security, and admin roles.</w:t>
+      </w:r>
+    </w:p>
+    <w:p>
+      <w:pPr>
+        <w:pStyle w:val="ListParagraph"/>
+        <w:numPr>
+          <w:ilvl w:val="0"/>
+          <w:numId w:val="2"/>
+        </w:numPr>
+        <w:spacing w:after="30" w:line="260"/>
+      </w:pPr>
+      <w:r>
+        <w:rPr>
+          <w:rFonts w:ascii="Calibri" w:cs="Calibri" w:eastAsia="Calibri" w:hAnsi="Calibri"/>
+          <w:color w:val="1A1A1A"/>
+          <w:sz w:val="19"/>
+          <w:szCs w:val="19"/>
+        </w:rPr>
+        <w:t xml:space="preserve">Visitor QR token generation, emergency security &amp; ambulance alerts, incident reporting with photo attachments, artisan and property directories, construction-site registration, and airtime/data VTU purchases. Live on Google Play and Apple App Store.</w:t>
       </w:r>
     </w:p>
     <w:p>
@@ -1143,26 +1162,45 @@
           <w:sz w:val="21"/>
           <w:szCs w:val="21"/>
         </w:rPr>
-        <w:t xml:space="preserve">MRA SWzone Estate App (Magodo Residents Association)</w:t>
-      </w:r>
-    </w:p>
-    <w:p>
-      <w:pPr>
-        <w:pStyle w:val="ListParagraph"/>
-        <w:numPr>
-          <w:ilvl w:val="0"/>
-          <w:numId w:val="2"/>
-        </w:numPr>
-        <w:spacing w:after="30" w:line="260"/>
-      </w:pPr>
-      <w:r>
-        <w:rPr>
-          <w:rFonts w:ascii="Calibri" w:cs="Calibri" w:eastAsia="Calibri" w:hAnsi="Calibri"/>
-          <w:color w:val="1A1A1A"/>
-          <w:sz w:val="19"/>
-          <w:szCs w:val="19"/>
-        </w:rPr>
-        <w:t xml:space="preserve">Led end-to-end development (Flutter/Riverpod frontend + NestJS backend) for residential estate management — visitor QR token generation, emergency security &amp; ambulance alerts, incident reporting with photo attachments, artisan and property directories, construction-site registration, and airtime/data VTU purchases. In store testing.</w:t>
+        <w:t xml:space="preserve">KeyVend — Estate Digital Key App</w:t>
+      </w:r>
+    </w:p>
+    <w:p>
+      <w:pPr>
+        <w:pStyle w:val="ListParagraph"/>
+        <w:numPr>
+          <w:ilvl w:val="0"/>
+          <w:numId w:val="2"/>
+        </w:numPr>
+        <w:spacing w:after="30" w:line="260"/>
+      </w:pPr>
+      <w:r>
+        <w:rPr>
+          <w:rFonts w:ascii="Calibri" w:cs="Calibri" w:eastAsia="Calibri" w:hAnsi="Calibri"/>
+          <w:color w:val="1A1A1A"/>
+          <w:sz w:val="19"/>
+          <w:szCs w:val="19"/>
+        </w:rPr>
+        <w:t xml:space="preserve">Flutter app for residents of Lekki Gardens Phase 2 — in-app wallet with fund/pay flows, visitor PIN generation and gate-access management, and service-charge/levy payments.</w:t>
+      </w:r>
+    </w:p>
+    <w:p>
+      <w:pPr>
+        <w:pStyle w:val="ListParagraph"/>
+        <w:numPr>
+          <w:ilvl w:val="0"/>
+          <w:numId w:val="2"/>
+        </w:numPr>
+        <w:spacing w:after="30" w:line="260"/>
+      </w:pPr>
+      <w:r>
+        <w:rPr>
+          <w:rFonts w:ascii="Calibri" w:cs="Calibri" w:eastAsia="Calibri" w:hAnsi="Calibri"/>
+          <w:color w:val="1A1A1A"/>
+          <w:sz w:val="19"/>
+          <w:szCs w:val="19"/>
+        </w:rPr>
+        <w:t xml:space="preserve">Smart water-meter token purchases, dependents management, estate announcements, and support ticketing. In development.</w:t>
       </w:r>
     </w:p>
     <w:p>

</xml_diff>

<commit_message>
Fix phone, LinkedIn, GitHub links
</commit_message>
<xml_diff>
--- a/Adeyemi_Misturah_Resume.docx
+++ b/Adeyemi_Misturah_Resume.docx
@@ -31,7 +31,7 @@
           <w:sz w:val="18"/>
           <w:szCs w:val="18"/>
         </w:rPr>
-        <w:t xml:space="preserve">+234 906 512 1778  •  misturahadeyemi51@gmail.com  •  Ogba, Lagos State, Nigeria</w:t>
+        <w:t xml:space="preserve">+234 803 830 2869  •  misturahadeyemi51@gmail.com  •  Ogba, Lagos State, Nigeria</w:t>
       </w:r>
     </w:p>
     <w:p>
@@ -39,7 +39,7 @@
         <w:spacing w:after="100"/>
         <w:jc w:val="center"/>
       </w:pPr>
-      <w:hyperlink w:history="1" r:id="rIdgjlak18ktsc0bsji3-9-v">
+      <w:hyperlink w:history="1" r:id="rId21agnfsd7xsvbzf1d_npw">
         <w:r>
           <w:rPr>
             <w:rFonts w:ascii="Calibri" w:cs="Calibri" w:eastAsia="Calibri" w:hAnsi="Calibri"/>
@@ -60,7 +60,7 @@
         </w:rPr>
         <w:t xml:space="preserve">  •  </w:t>
       </w:r>
-      <w:hyperlink w:history="1" r:id="rIdgkstfayo5z7flamvr2ohd">
+      <w:hyperlink w:history="1" r:id="rIdzhw3mypvtgpdh-dpancjs">
         <w:r>
           <w:rPr>
             <w:rFonts w:ascii="Calibri" w:cs="Calibri" w:eastAsia="Calibri" w:hAnsi="Calibri"/>
@@ -81,7 +81,7 @@
         </w:rPr>
         <w:t xml:space="preserve">  •  </w:t>
       </w:r>
-      <w:hyperlink w:history="1" r:id="rIda6oyalpcabrkt2o-7qh3w">
+      <w:hyperlink w:history="1" r:id="rIduifeaxti9fbvtclgtqkny">
         <w:r>
           <w:rPr>
             <w:rFonts w:ascii="Calibri" w:cs="Calibri" w:eastAsia="Calibri" w:hAnsi="Calibri"/>

</xml_diff>